<commit_message>
Another explanation of linear regression
</commit_message>
<xml_diff>
--- a/machine_learning_basics/simple linear regression.docx
+++ b/machine_learning_basics/simple linear regression.docx
@@ -1,6 +1,6 @@
 
 <file path=word/document.xml><?xml version="1.0" encoding="utf-8"?>
-<w:document xmlns:wpc="http://schemas.microsoft.com/office/word/2010/wordprocessingCanvas" xmlns:cx="http://schemas.microsoft.com/office/drawing/2014/chartex" xmlns:cx1="http://schemas.microsoft.com/office/drawing/2015/9/8/chartex" xmlns:cx2="http://schemas.microsoft.com/office/drawing/2015/10/21/chartex" xmlns:cx3="http://schemas.microsoft.com/office/drawing/2016/5/9/chartex" xmlns:cx4="http://schemas.microsoft.com/office/drawing/2016/5/10/chartex" xmlns:cx5="http://schemas.microsoft.com/office/drawing/2016/5/11/chartex" xmlns:cx6="http://schemas.microsoft.com/office/drawing/2016/5/12/chartex" xmlns:cx7="http://schemas.microsoft.com/office/drawing/2016/5/13/chartex" xmlns:cx8="http://schemas.microsoft.com/office/drawing/2016/5/14/chartex" xmlns:mc="http://schemas.openxmlformats.org/markup-compatibility/2006" xmlns:aink="http://schemas.microsoft.com/office/drawing/2016/ink" xmlns:am3d="http://schemas.microsoft.com/office/drawing/2017/model3d" xmlns:o="urn:schemas-microsoft-com:office:office" xmlns:oel="http://schemas.microsoft.com/office/2019/extlst" xmlns:r="http://schemas.openxmlformats.org/officeDocument/2006/relationships" xmlns:m="http://schemas.openxmlformats.org/officeDocument/2006/math" xmlns:v="urn:schemas-microsoft-com:vml" xmlns:wp14="http://schemas.microsoft.com/office/word/2010/wordprocessingDrawing" xmlns:wp="http://schemas.openxmlformats.org/drawingml/2006/wordprocessingDrawing" xmlns:w10="urn:schemas-microsoft-com:office:word" xmlns:w="http://schemas.openxmlformats.org/wordprocessingml/2006/main" xmlns:w14="http://schemas.microsoft.com/office/word/2010/wordml" xmlns:w15="http://schemas.microsoft.com/office/word/2012/wordml" xmlns:w16cex="http://schemas.microsoft.com/office/word/2018/wordml/cex" xmlns:w16cid="http://schemas.microsoft.com/office/word/2016/wordml/cid" xmlns:w16="http://schemas.microsoft.com/office/word/2018/wordml" xmlns:w16du="http://schemas.microsoft.com/office/word/2023/wordml/word16du" xmlns:w16sdtdh="http://schemas.microsoft.com/office/word/2020/wordml/sdtdatahash" xmlns:w16se="http://schemas.microsoft.com/office/word/2015/wordml/symex" xmlns:wpg="http://schemas.microsoft.com/office/word/2010/wordprocessingGroup" xmlns:wpi="http://schemas.microsoft.com/office/word/2010/wordprocessingInk" xmlns:wne="http://schemas.microsoft.com/office/word/2006/wordml" xmlns:wps="http://schemas.microsoft.com/office/word/2010/wordprocessingShape" mc:Ignorable="w14 w15 w16se w16cid w16 w16cex w16sdtdh w16du wp14">
+<w:document xmlns:wpc="http://schemas.microsoft.com/office/word/2010/wordprocessingCanvas" xmlns:cx="http://schemas.microsoft.com/office/drawing/2014/chartex" xmlns:cx1="http://schemas.microsoft.com/office/drawing/2015/9/8/chartex" xmlns:cx2="http://schemas.microsoft.com/office/drawing/2015/10/21/chartex" xmlns:cx3="http://schemas.microsoft.com/office/drawing/2016/5/9/chartex" xmlns:cx4="http://schemas.microsoft.com/office/drawing/2016/5/10/chartex" xmlns:cx5="http://schemas.microsoft.com/office/drawing/2016/5/11/chartex" xmlns:cx6="http://schemas.microsoft.com/office/drawing/2016/5/12/chartex" xmlns:cx7="http://schemas.microsoft.com/office/drawing/2016/5/13/chartex" xmlns:cx8="http://schemas.microsoft.com/office/drawing/2016/5/14/chartex" xmlns:mc="http://schemas.openxmlformats.org/markup-compatibility/2006" xmlns:aink="http://schemas.microsoft.com/office/drawing/2016/ink" xmlns:am3d="http://schemas.microsoft.com/office/drawing/2017/model3d" xmlns:o="urn:schemas-microsoft-com:office:office" xmlns:oel="http://schemas.microsoft.com/office/2019/extlst" xmlns:r="http://schemas.openxmlformats.org/officeDocument/2006/relationships" xmlns:m="http://schemas.openxmlformats.org/officeDocument/2006/math" xmlns:v="urn:schemas-microsoft-com:vml" xmlns:wp14="http://schemas.microsoft.com/office/word/2010/wordprocessingDrawing" xmlns:wp="http://schemas.openxmlformats.org/drawingml/2006/wordprocessingDrawing" xmlns:w10="urn:schemas-microsoft-com:office:word" xmlns:w="http://schemas.openxmlformats.org/wordprocessingml/2006/main" xmlns:w14="http://schemas.microsoft.com/office/word/2010/wordml" xmlns:w15="http://schemas.microsoft.com/office/word/2012/wordml" xmlns:w16cex="http://schemas.microsoft.com/office/word/2018/wordml/cex" xmlns:w16cid="http://schemas.microsoft.com/office/word/2016/wordml/cid" xmlns:w16="http://schemas.microsoft.com/office/word/2018/wordml" xmlns:w16du="http://schemas.microsoft.com/office/word/2023/wordml/word16du" xmlns:w16sdtdh="http://schemas.microsoft.com/office/word/2020/wordml/sdtdatahash" xmlns:w16sdtfl="http://schemas.microsoft.com/office/word/2024/wordml/sdtformatlock" xmlns:w16se="http://schemas.microsoft.com/office/word/2015/wordml/symex" xmlns:wpg="http://schemas.microsoft.com/office/word/2010/wordprocessingGroup" xmlns:wpi="http://schemas.microsoft.com/office/word/2010/wordprocessingInk" xmlns:wne="http://schemas.microsoft.com/office/word/2006/wordml" xmlns:wps="http://schemas.microsoft.com/office/word/2010/wordprocessingShape" mc:Ignorable="w14 w15 w16se w16cid w16 w16cex w16sdtdh w16sdtfl w16du wp14">
   <w:body>
     <w:p>
       <w:pPr>
@@ -28,6 +28,7 @@
         <w:rPr>
           <w:b/>
           <w:bCs/>
+          <w:noProof/>
         </w:rPr>
         <w:drawing>
           <wp:inline distT="0" distB="0" distL="0" distR="0" wp14:anchorId="2123863C" wp14:editId="6AE18256">
@@ -73,6 +74,9 @@
     </w:p>
     <w:p>
       <w:r>
+        <w:rPr>
+          <w:noProof/>
+        </w:rPr>
         <w:drawing>
           <wp:inline distT="0" distB="0" distL="0" distR="0" wp14:anchorId="1DE7B067" wp14:editId="5C67107F">
             <wp:extent cx="2415749" cy="1409822"/>
@@ -117,6 +121,9 @@
     </w:p>
     <w:p>
       <w:r>
+        <w:rPr>
+          <w:noProof/>
+        </w:rPr>
         <w:drawing>
           <wp:inline distT="0" distB="0" distL="0" distR="0" wp14:anchorId="218C372C" wp14:editId="1B2D5406">
             <wp:extent cx="1988992" cy="1295512"/>
@@ -181,6 +188,9 @@
     </w:p>
     <w:p>
       <w:r>
+        <w:rPr>
+          <w:noProof/>
+        </w:rPr>
         <w:lastRenderedPageBreak/>
         <w:drawing>
           <wp:inline distT="0" distB="0" distL="0" distR="0" wp14:anchorId="4E43B6DE" wp14:editId="523F758B">
@@ -222,6 +232,9 @@
     <w:p/>
     <w:p>
       <w:r>
+        <w:rPr>
+          <w:noProof/>
+        </w:rPr>
         <w:drawing>
           <wp:inline distT="0" distB="0" distL="0" distR="0" wp14:anchorId="4B64F6FE" wp14:editId="1987D4A6">
             <wp:extent cx="5731510" cy="3002280"/>
@@ -261,8 +274,135 @@
     </w:p>
     <w:p/>
     <w:p>
-      <w:r>
-        <w:t>Here w</w:t>
+      <w:pPr>
+        <w:rPr>
+          <w:b/>
+          <w:bCs/>
+        </w:rPr>
+      </w:pPr>
+      <w:r>
+        <w:rPr>
+          <w:b/>
+          <w:bCs/>
+        </w:rPr>
+        <w:t>EXPLANATION TWO:</w:t>
+      </w:r>
+    </w:p>
+    <w:p>
+      <w:r>
+        <w:t xml:space="preserve">In below graph we </w:t>
+      </w:r>
+      <w:r>
+        <w:t xml:space="preserve">going to predict a person’s height by their age. </w:t>
+      </w:r>
+    </w:p>
+    <w:p>
+      <w:r>
+        <w:lastRenderedPageBreak/>
+        <w:drawing>
+          <wp:inline distT="0" distB="0" distL="0" distR="0" wp14:anchorId="1D111FF2" wp14:editId="36BE2FAB">
+            <wp:extent cx="5731510" cy="2306320"/>
+            <wp:effectExtent l="0" t="0" r="2540" b="0"/>
+            <wp:docPr id="1127455051" name="Picture 1"/>
+            <wp:cNvGraphicFramePr>
+              <a:graphicFrameLocks xmlns:a="http://schemas.openxmlformats.org/drawingml/2006/main" noChangeAspect="1"/>
+            </wp:cNvGraphicFramePr>
+            <a:graphic xmlns:a="http://schemas.openxmlformats.org/drawingml/2006/main">
+              <a:graphicData uri="http://schemas.openxmlformats.org/drawingml/2006/picture">
+                <pic:pic xmlns:pic="http://schemas.openxmlformats.org/drawingml/2006/picture">
+                  <pic:nvPicPr>
+                    <pic:cNvPr id="1127455051" name=""/>
+                    <pic:cNvPicPr/>
+                  </pic:nvPicPr>
+                  <pic:blipFill>
+                    <a:blip r:embed="rId9"/>
+                    <a:stretch>
+                      <a:fillRect/>
+                    </a:stretch>
+                  </pic:blipFill>
+                  <pic:spPr>
+                    <a:xfrm>
+                      <a:off x="0" y="0"/>
+                      <a:ext cx="5731510" cy="2306320"/>
+                    </a:xfrm>
+                    <a:prstGeom prst="rect">
+                      <a:avLst/>
+                    </a:prstGeom>
+                  </pic:spPr>
+                </pic:pic>
+              </a:graphicData>
+            </a:graphic>
+          </wp:inline>
+        </w:drawing>
+      </w:r>
+    </w:p>
+    <w:p>
+      <w:r>
+        <w:t>To predict that age(x) is the input variable or independent variable, y is output target dependant variable.</w:t>
+      </w:r>
+      <w:r>
+        <w:t xml:space="preserve"> Here the value is slop </w:t>
+      </w:r>
+      <w:r>
+        <w:t xml:space="preserve">m </w:t>
+      </w:r>
+      <w:r>
+        <w:t xml:space="preserve">is nothing, it tell the value of the line </w:t>
+      </w:r>
+      <w:r>
+        <w:t>which has a curve from the value</w:t>
+      </w:r>
+      <w:r>
+        <w:t>.</w:t>
+      </w:r>
+    </w:p>
+    <w:p>
+      <w:r>
+        <w:t xml:space="preserve">And intercept is the starting point of line from y axis. </w:t>
+      </w:r>
+    </w:p>
+    <w:p>
+      <w:r>
+        <w:t>The optimal value of slope and intercept will produce a straight line, that optimal values will be found by machine learning algorithm.</w:t>
+      </w:r>
+      <w:r>
+        <w:t xml:space="preserve"> </w:t>
+      </w:r>
+      <w:r>
+        <w:rPr>
+          <w:b/>
+          <w:bCs/>
+        </w:rPr>
+        <w:t>Gradient descent</w:t>
+      </w:r>
+      <w:r>
+        <w:t xml:space="preserve"> are used to adjusting the lines to find the optimal values which has less error. </w:t>
+      </w:r>
+    </w:p>
+    <w:p/>
+    <w:p>
+      <w:pPr>
+        <w:rPr>
+          <w:b/>
+          <w:bCs/>
+        </w:rPr>
+      </w:pPr>
+      <w:r>
+        <w:rPr>
+          <w:b/>
+          <w:bCs/>
+        </w:rPr>
+        <w:t>MULTI LINEAR REGRESION</w:t>
+      </w:r>
+    </w:p>
+    <w:p>
+      <w:r>
+        <w:t>Depends on more than one independent variable to predict the target variable.</w:t>
+      </w:r>
+    </w:p>
+    <w:p>
+      <w:r>
+        <w:t>EX: Price of a house will need many inputs like, area of the house, available room, does it have swimming pool and so on.</w:t>
       </w:r>
     </w:p>
     <w:sectPr>
@@ -276,7 +416,7 @@
 </file>
 
 <file path=word/styles.xml><?xml version="1.0" encoding="utf-8"?>
-<w:styles xmlns:mc="http://schemas.openxmlformats.org/markup-compatibility/2006" xmlns:r="http://schemas.openxmlformats.org/officeDocument/2006/relationships" xmlns:w="http://schemas.openxmlformats.org/wordprocessingml/2006/main" xmlns:w14="http://schemas.microsoft.com/office/word/2010/wordml" xmlns:w15="http://schemas.microsoft.com/office/word/2012/wordml" xmlns:w16cex="http://schemas.microsoft.com/office/word/2018/wordml/cex" xmlns:w16cid="http://schemas.microsoft.com/office/word/2016/wordml/cid" xmlns:w16="http://schemas.microsoft.com/office/word/2018/wordml" xmlns:w16du="http://schemas.microsoft.com/office/word/2023/wordml/word16du" xmlns:w16sdtdh="http://schemas.microsoft.com/office/word/2020/wordml/sdtdatahash" xmlns:w16se="http://schemas.microsoft.com/office/word/2015/wordml/symex" mc:Ignorable="w14 w15 w16se w16cid w16 w16cex w16sdtdh w16du">
+<w:styles xmlns:mc="http://schemas.openxmlformats.org/markup-compatibility/2006" xmlns:r="http://schemas.openxmlformats.org/officeDocument/2006/relationships" xmlns:w="http://schemas.openxmlformats.org/wordprocessingml/2006/main" xmlns:w14="http://schemas.microsoft.com/office/word/2010/wordml" xmlns:w15="http://schemas.microsoft.com/office/word/2012/wordml" xmlns:w16cex="http://schemas.microsoft.com/office/word/2018/wordml/cex" xmlns:w16cid="http://schemas.microsoft.com/office/word/2016/wordml/cid" xmlns:w16="http://schemas.microsoft.com/office/word/2018/wordml" xmlns:w16du="http://schemas.microsoft.com/office/word/2023/wordml/word16du" xmlns:w16sdtdh="http://schemas.microsoft.com/office/word/2020/wordml/sdtdatahash" xmlns:w16sdtfl="http://schemas.microsoft.com/office/word/2024/wordml/sdtformatlock" xmlns:w16se="http://schemas.microsoft.com/office/word/2015/wordml/symex" mc:Ignorable="w14 w15 w16se w16cid w16 w16cex w16sdtdh w16sdtfl w16du">
   <w:docDefaults>
     <w:rPrDefault>
       <w:rPr>

</xml_diff>

<commit_message>
linear regression mean square error formula
</commit_message>
<xml_diff>
--- a/machine_learning_basics/simple linear regression.docx
+++ b/machine_learning_basics/simple linear regression.docx
@@ -229,12 +229,115 @@
         </w:drawing>
       </w:r>
     </w:p>
+    <w:p>
+      <w:r>
+        <w:t>The above y formula can be represented by following way</w:t>
+      </w:r>
+    </w:p>
+    <w:p>
+      <w:r>
+        <w:drawing>
+          <wp:inline distT="0" distB="0" distL="0" distR="0" wp14:anchorId="731BC2B1" wp14:editId="0B08EF0C">
+            <wp:extent cx="2095682" cy="655377"/>
+            <wp:effectExtent l="0" t="0" r="0" b="0"/>
+            <wp:docPr id="467144654" name="Picture 1"/>
+            <wp:cNvGraphicFramePr>
+              <a:graphicFrameLocks xmlns:a="http://schemas.openxmlformats.org/drawingml/2006/main" noChangeAspect="1"/>
+            </wp:cNvGraphicFramePr>
+            <a:graphic xmlns:a="http://schemas.openxmlformats.org/drawingml/2006/main">
+              <a:graphicData uri="http://schemas.openxmlformats.org/drawingml/2006/picture">
+                <pic:pic xmlns:pic="http://schemas.openxmlformats.org/drawingml/2006/picture">
+                  <pic:nvPicPr>
+                    <pic:cNvPr id="467144654" name=""/>
+                    <pic:cNvPicPr/>
+                  </pic:nvPicPr>
+                  <pic:blipFill>
+                    <a:blip r:embed="rId8"/>
+                    <a:stretch>
+                      <a:fillRect/>
+                    </a:stretch>
+                  </pic:blipFill>
+                  <pic:spPr>
+                    <a:xfrm>
+                      <a:off x="0" y="0"/>
+                      <a:ext cx="2095682" cy="655377"/>
+                    </a:xfrm>
+                    <a:prstGeom prst="rect">
+                      <a:avLst/>
+                    </a:prstGeom>
+                  </pic:spPr>
+                </pic:pic>
+              </a:graphicData>
+            </a:graphic>
+          </wp:inline>
+        </w:drawing>
+      </w:r>
+    </w:p>
+    <w:p>
+      <w:r>
+        <w:drawing>
+          <wp:inline distT="0" distB="0" distL="0" distR="0" wp14:anchorId="6BF2A3AD" wp14:editId="567E2360">
+            <wp:extent cx="4389500" cy="1425063"/>
+            <wp:effectExtent l="0" t="0" r="0" b="3810"/>
+            <wp:docPr id="2100958790" name="Picture 1"/>
+            <wp:cNvGraphicFramePr>
+              <a:graphicFrameLocks xmlns:a="http://schemas.openxmlformats.org/drawingml/2006/main" noChangeAspect="1"/>
+            </wp:cNvGraphicFramePr>
+            <a:graphic xmlns:a="http://schemas.openxmlformats.org/drawingml/2006/main">
+              <a:graphicData uri="http://schemas.openxmlformats.org/drawingml/2006/picture">
+                <pic:pic xmlns:pic="http://schemas.openxmlformats.org/drawingml/2006/picture">
+                  <pic:nvPicPr>
+                    <pic:cNvPr id="2100958790" name=""/>
+                    <pic:cNvPicPr/>
+                  </pic:nvPicPr>
+                  <pic:blipFill>
+                    <a:blip r:embed="rId9"/>
+                    <a:stretch>
+                      <a:fillRect/>
+                    </a:stretch>
+                  </pic:blipFill>
+                  <pic:spPr>
+                    <a:xfrm>
+                      <a:off x="0" y="0"/>
+                      <a:ext cx="4389500" cy="1425063"/>
+                    </a:xfrm>
+                    <a:prstGeom prst="rect">
+                      <a:avLst/>
+                    </a:prstGeom>
+                  </pic:spPr>
+                </pic:pic>
+              </a:graphicData>
+            </a:graphic>
+          </wp:inline>
+        </w:drawing>
+      </w:r>
+    </w:p>
     <w:p/>
     <w:p>
+      <w:pPr>
+        <w:rPr>
+          <w:b/>
+          <w:bCs/>
+        </w:rPr>
+      </w:pPr>
+      <w:r>
+        <w:t xml:space="preserve">This is the actual formula used to find </w:t>
+      </w:r>
+      <w:r>
+        <w:rPr>
+          <w:b/>
+          <w:bCs/>
+        </w:rPr>
+        <w:t>best fit line</w:t>
+      </w:r>
+    </w:p>
+    <w:p/>
+    <w:p>
       <w:r>
         <w:rPr>
           <w:noProof/>
         </w:rPr>
+        <w:lastRenderedPageBreak/>
         <w:drawing>
           <wp:inline distT="0" distB="0" distL="0" distR="0" wp14:anchorId="4B64F6FE" wp14:editId="1987D4A6">
             <wp:extent cx="5731510" cy="3002280"/>
@@ -251,7 +354,7 @@
                     <pic:cNvPicPr/>
                   </pic:nvPicPr>
                   <pic:blipFill>
-                    <a:blip r:embed="rId8"/>
+                    <a:blip r:embed="rId10"/>
                     <a:stretch>
                       <a:fillRect/>
                     </a:stretch>
@@ -273,6 +376,7 @@
       </w:r>
     </w:p>
     <w:p/>
+    <w:p/>
     <w:p>
       <w:pPr>
         <w:rPr>
@@ -287,6 +391,30 @@
         </w:rPr>
         <w:t>EXPLANATION TWO:</w:t>
       </w:r>
+      <w:r>
+        <w:rPr>
+          <w:b/>
+          <w:bCs/>
+        </w:rPr>
+        <w:t xml:space="preserve"> (</w:t>
+      </w:r>
+      <w:hyperlink r:id="rId11" w:history="1">
+        <w:r>
+          <w:rPr>
+            <w:rStyle w:val="Hyperlink"/>
+            <w:b/>
+            <w:bCs/>
+          </w:rPr>
+          <w:t>Machine Learning Full Course For Beginners | With 10+ Projects | Adi Explains</w:t>
+        </w:r>
+      </w:hyperlink>
+      <w:r>
+        <w:rPr>
+          <w:b/>
+          <w:bCs/>
+        </w:rPr>
+        <w:t>)</w:t>
+      </w:r>
     </w:p>
     <w:p>
       <w:r>
@@ -298,7 +426,9 @@
     </w:p>
     <w:p>
       <w:r>
-        <w:lastRenderedPageBreak/>
+        <w:rPr>
+          <w:noProof/>
+        </w:rPr>
         <w:drawing>
           <wp:inline distT="0" distB="0" distL="0" distR="0" wp14:anchorId="1D111FF2" wp14:editId="36BE2FAB">
             <wp:extent cx="5731510" cy="2306320"/>
@@ -315,7 +445,7 @@
                     <pic:cNvPicPr/>
                   </pic:nvPicPr>
                   <pic:blipFill>
-                    <a:blip r:embed="rId9"/>
+                    <a:blip r:embed="rId12"/>
                     <a:stretch>
                       <a:fillRect/>
                     </a:stretch>
@@ -392,6 +522,7 @@
           <w:b/>
           <w:bCs/>
         </w:rPr>
+        <w:lastRenderedPageBreak/>
         <w:t>MULTI LINEAR REGRESION</w:t>
       </w:r>
     </w:p>
@@ -403,6 +534,120 @@
     <w:p>
       <w:r>
         <w:t>EX: Price of a house will need many inputs like, area of the house, available room, does it have swimming pool and so on.</w:t>
+      </w:r>
+    </w:p>
+    <w:p/>
+    <w:p>
+      <w:pPr>
+        <w:rPr>
+          <w:b/>
+          <w:bCs/>
+        </w:rPr>
+      </w:pPr>
+      <w:r>
+        <w:rPr>
+          <w:b/>
+          <w:bCs/>
+        </w:rPr>
+        <w:t>WHAT TYPES OF DATA CAN WE USE LINEAR REGRESSION AND CANNOT WE USE LINEAR REGRESSION</w:t>
+      </w:r>
+    </w:p>
+    <w:p>
+      <w:pPr>
+        <w:rPr>
+          <w:b/>
+          <w:bCs/>
+        </w:rPr>
+      </w:pPr>
+      <w:r>
+        <w:rPr>
+          <w:b/>
+          <w:bCs/>
+        </w:rPr>
+        <w:drawing>
+          <wp:inline distT="0" distB="0" distL="0" distR="0" wp14:anchorId="1F897C97" wp14:editId="034BB61D">
+            <wp:extent cx="5731510" cy="3843655"/>
+            <wp:effectExtent l="0" t="0" r="2540" b="4445"/>
+            <wp:docPr id="423563594" name="Picture 1"/>
+            <wp:cNvGraphicFramePr>
+              <a:graphicFrameLocks xmlns:a="http://schemas.openxmlformats.org/drawingml/2006/main" noChangeAspect="1"/>
+            </wp:cNvGraphicFramePr>
+            <a:graphic xmlns:a="http://schemas.openxmlformats.org/drawingml/2006/main">
+              <a:graphicData uri="http://schemas.openxmlformats.org/drawingml/2006/picture">
+                <pic:pic xmlns:pic="http://schemas.openxmlformats.org/drawingml/2006/picture">
+                  <pic:nvPicPr>
+                    <pic:cNvPr id="423563594" name=""/>
+                    <pic:cNvPicPr/>
+                  </pic:nvPicPr>
+                  <pic:blipFill>
+                    <a:blip r:embed="rId13"/>
+                    <a:stretch>
+                      <a:fillRect/>
+                    </a:stretch>
+                  </pic:blipFill>
+                  <pic:spPr>
+                    <a:xfrm>
+                      <a:off x="0" y="0"/>
+                      <a:ext cx="5731510" cy="3843655"/>
+                    </a:xfrm>
+                    <a:prstGeom prst="rect">
+                      <a:avLst/>
+                    </a:prstGeom>
+                  </pic:spPr>
+                </pic:pic>
+              </a:graphicData>
+            </a:graphic>
+          </wp:inline>
+        </w:drawing>
+      </w:r>
+    </w:p>
+    <w:p>
+      <w:pPr>
+        <w:rPr>
+          <w:b/>
+          <w:bCs/>
+        </w:rPr>
+      </w:pPr>
+      <w:r>
+        <w:rPr>
+          <w:b/>
+          <w:bCs/>
+        </w:rPr>
+        <w:drawing>
+          <wp:inline distT="0" distB="0" distL="0" distR="0" wp14:anchorId="7639B53C" wp14:editId="6CD5856D">
+            <wp:extent cx="5731510" cy="1622425"/>
+            <wp:effectExtent l="0" t="0" r="2540" b="0"/>
+            <wp:docPr id="1703243368" name="Picture 1"/>
+            <wp:cNvGraphicFramePr>
+              <a:graphicFrameLocks xmlns:a="http://schemas.openxmlformats.org/drawingml/2006/main" noChangeAspect="1"/>
+            </wp:cNvGraphicFramePr>
+            <a:graphic xmlns:a="http://schemas.openxmlformats.org/drawingml/2006/main">
+              <a:graphicData uri="http://schemas.openxmlformats.org/drawingml/2006/picture">
+                <pic:pic xmlns:pic="http://schemas.openxmlformats.org/drawingml/2006/picture">
+                  <pic:nvPicPr>
+                    <pic:cNvPr id="1703243368" name=""/>
+                    <pic:cNvPicPr/>
+                  </pic:nvPicPr>
+                  <pic:blipFill>
+                    <a:blip r:embed="rId14"/>
+                    <a:stretch>
+                      <a:fillRect/>
+                    </a:stretch>
+                  </pic:blipFill>
+                  <pic:spPr>
+                    <a:xfrm>
+                      <a:off x="0" y="0"/>
+                      <a:ext cx="5731510" cy="1622425"/>
+                    </a:xfrm>
+                    <a:prstGeom prst="rect">
+                      <a:avLst/>
+                    </a:prstGeom>
+                  </pic:spPr>
+                </pic:pic>
+              </a:graphicData>
+            </a:graphic>
+          </wp:inline>
+        </w:drawing>
       </w:r>
     </w:p>
     <w:sectPr>
@@ -819,7 +1064,6 @@
   <w:style w:type="character" w:default="1" w:styleId="DefaultParagraphFont">
     <w:name w:val="Default Paragraph Font"/>
     <w:uiPriority w:val="1"/>
-    <w:semiHidden/>
     <w:unhideWhenUsed/>
   </w:style>
   <w:style w:type="table" w:default="1" w:styleId="TableNormal">
@@ -842,6 +1086,29 @@
     <w:uiPriority w:val="99"/>
     <w:semiHidden/>
     <w:unhideWhenUsed/>
+  </w:style>
+  <w:style w:type="character" w:styleId="Hyperlink">
+    <w:name w:val="Hyperlink"/>
+    <w:basedOn w:val="DefaultParagraphFont"/>
+    <w:uiPriority w:val="99"/>
+    <w:unhideWhenUsed/>
+    <w:rsid w:val="000A10F4"/>
+    <w:rPr>
+      <w:color w:val="0563C1" w:themeColor="hyperlink"/>
+      <w:u w:val="single"/>
+    </w:rPr>
+  </w:style>
+  <w:style w:type="character" w:styleId="UnresolvedMention">
+    <w:name w:val="Unresolved Mention"/>
+    <w:basedOn w:val="DefaultParagraphFont"/>
+    <w:uiPriority w:val="99"/>
+    <w:semiHidden/>
+    <w:unhideWhenUsed/>
+    <w:rsid w:val="000A10F4"/>
+    <w:rPr>
+      <w:color w:val="605E5C"/>
+      <w:shd w:val="clear" w:color="auto" w:fill="E1DFDD"/>
+    </w:rPr>
   </w:style>
 </w:styles>
 </file>

</xml_diff>

<commit_message>
Importance of correlation with heatmap for linear regression model
</commit_message>
<xml_diff>
--- a/machine_learning_basics/simple linear regression.docx
+++ b/machine_learning_basics/simple linear regression.docx
@@ -236,6 +236,9 @@
     </w:p>
     <w:p>
       <w:r>
+        <w:rPr>
+          <w:noProof/>
+        </w:rPr>
         <w:drawing>
           <wp:inline distT="0" distB="0" distL="0" distR="0" wp14:anchorId="731BC2B1" wp14:editId="0B08EF0C">
             <wp:extent cx="2095682" cy="655377"/>
@@ -275,6 +278,9 @@
     </w:p>
     <w:p>
       <w:r>
+        <w:rPr>
+          <w:noProof/>
+        </w:rPr>
         <w:drawing>
           <wp:inline distT="0" distB="0" distL="0" distR="0" wp14:anchorId="6BF2A3AD" wp14:editId="567E2360">
             <wp:extent cx="4389500" cy="1425063"/>
@@ -563,6 +569,7 @@
         <w:rPr>
           <w:b/>
           <w:bCs/>
+          <w:noProof/>
         </w:rPr>
         <w:drawing>
           <wp:inline distT="0" distB="0" distL="0" distR="0" wp14:anchorId="1F897C97" wp14:editId="034BB61D">
@@ -612,6 +619,7 @@
         <w:rPr>
           <w:b/>
           <w:bCs/>
+          <w:noProof/>
         </w:rPr>
         <w:drawing>
           <wp:inline distT="0" distB="0" distL="0" distR="0" wp14:anchorId="7639B53C" wp14:editId="6CD5856D">
@@ -648,6 +656,26 @@
             </a:graphic>
           </wp:inline>
         </w:drawing>
+      </w:r>
+    </w:p>
+    <w:p>
+      <w:pPr>
+        <w:rPr>
+          <w:b/>
+          <w:bCs/>
+        </w:rPr>
+      </w:pPr>
+      <w:r>
+        <w:rPr>
+          <w:b/>
+          <w:bCs/>
+        </w:rPr>
+        <w:t>IMPORTANT NOTE:</w:t>
+      </w:r>
+    </w:p>
+    <w:p>
+      <w:r>
+        <w:t>See correlation for linear regression file to know which type of values or features should be used to train the linear regression model.</w:t>
       </w:r>
     </w:p>
     <w:sectPr>
@@ -1064,6 +1092,7 @@
   <w:style w:type="character" w:default="1" w:styleId="DefaultParagraphFont">
     <w:name w:val="Default Paragraph Font"/>
     <w:uiPriority w:val="1"/>
+    <w:semiHidden/>
     <w:unhideWhenUsed/>
   </w:style>
   <w:style w:type="table" w:default="1" w:styleId="TableNormal">

</xml_diff>